<commit_message>
Improve resume bullet alignment and spacing across all templates
- Add hanging indents to v3 bullet helper so wrapped lines align properly
- Unify skills bullet formatting in sidebars, grids, and split layout
- Honor selected bullet style consistently across all content types
- Add missing military section to Executive template
- Tighten v2 bullet spacing to match v3 quality
- Fix Word templates A-D with proper hanging indents and summary alignment

Co-authored-by: MarkAlanBrest <MarkAlanBrest@users.noreply.github.com>
</commit_message>
<xml_diff>
--- a/public/templates/TemplateA.docx
+++ b/public/templates/TemplateA.docx
@@ -241,7 +241,7 @@
         <w:keepNext/>
         <w:keepLines/>
         <w:spacing w:before="120"/>
-        <w:ind w:left="187"/>
+        <w:ind w:left="367" w:hanging="180"/>
         <w:rPr>
           <w:sz w:val="24"/>
           <w:szCs w:val="24"/>
@@ -259,7 +259,7 @@
       <w:pPr>
         <w:keepNext/>
         <w:keepLines/>
-        <w:ind w:left="180"/>
+        <w:ind w:left="360" w:hanging="180"/>
         <w:rPr>
           <w:sz w:val="24"/>
           <w:szCs w:val="24"/>
@@ -277,7 +277,7 @@
       <w:pPr>
         <w:keepNext/>
         <w:keepLines/>
-        <w:ind w:left="180"/>
+        <w:ind w:left="360" w:hanging="180"/>
         <w:rPr>
           <w:sz w:val="24"/>
           <w:szCs w:val="24"/>
@@ -295,7 +295,7 @@
       <w:pPr>
         <w:keepNext/>
         <w:keepLines/>
-        <w:ind w:left="180"/>
+        <w:ind w:left="360" w:hanging="180"/>
         <w:rPr>
           <w:sz w:val="24"/>
           <w:szCs w:val="24"/>
@@ -329,7 +329,7 @@
           <w:sz w:val="24"/>
           <w:szCs w:val="24"/>
         </w:rPr>
-        <w:t xml:space="preserve">   {#summary5}• {summary5}{/summary5}</w:t>
+        <w:t xml:space="preserve">{#summary5}• {summary5}{/summary5}</w:t>
       </w:r>
     </w:p>
     <w:p>
@@ -766,7 +766,7 @@
       <w:pPr>
         <w:keepNext/>
         <w:keepLines/>
-        <w:ind w:left="180"/>
+        <w:ind w:left="360" w:hanging="180"/>
         <w:rPr>
           <w:sz w:val="24"/>
           <w:szCs w:val="24"/>
@@ -784,7 +784,7 @@
       <w:pPr>
         <w:keepNext/>
         <w:keepLines/>
-        <w:ind w:left="180"/>
+        <w:ind w:left="360" w:hanging="180"/>
         <w:rPr>
           <w:sz w:val="24"/>
           <w:szCs w:val="24"/>
@@ -802,7 +802,7 @@
       <w:pPr>
         <w:keepNext/>
         <w:keepLines/>
-        <w:ind w:left="180"/>
+        <w:ind w:left="360" w:hanging="180"/>
         <w:rPr>
           <w:sz w:val="24"/>
           <w:szCs w:val="24"/>
@@ -820,7 +820,7 @@
       <w:pPr>
         <w:keepNext/>
         <w:keepLines/>
-        <w:ind w:left="180"/>
+        <w:ind w:left="360" w:hanging="180"/>
         <w:rPr>
           <w:sz w:val="24"/>
           <w:szCs w:val="24"/>
@@ -838,7 +838,7 @@
       <w:pPr>
         <w:keepNext/>
         <w:keepLines/>
-        <w:ind w:left="180"/>
+        <w:ind w:left="360" w:hanging="180"/>
         <w:rPr>
           <w:sz w:val="24"/>
           <w:szCs w:val="24"/>

</xml_diff>

<commit_message>
Add mini header with name and page number to all resume templates
- Add shared makeMiniHeader/resumeDoc helpers in v2 and v3 builders
- Wire repeating Word header (name left, page number right) into all 8 v3 styles
- Update template preview thumbnails to show the mini header bar
- Patch all Docxtemplater TemplateA-P .docx files with matching header XML

Co-authored-by: MarkAlanBrest <MarkAlanBrest@users.noreply.github.com>
</commit_message>
<xml_diff>
--- a/public/templates/TemplateA.docx
+++ b/public/templates/TemplateA.docx
@@ -1868,34 +1868,139 @@
 </file>
 
 <file path=word/header1.xml><?xml version="1.0" encoding="utf-8"?>
-<w:hdr xmlns:wpc="http://schemas.microsoft.com/office/word/2010/wordprocessingCanvas" xmlns:cx="http://schemas.microsoft.com/office/drawing/2014/chartex" xmlns:cx1="http://schemas.microsoft.com/office/drawing/2015/9/8/chartex" xmlns:cx2="http://schemas.microsoft.com/office/drawing/2015/10/21/chartex" xmlns:cx3="http://schemas.microsoft.com/office/drawing/2016/5/9/chartex" xmlns:cx4="http://schemas.microsoft.com/office/drawing/2016/5/10/chartex" xmlns:cx5="http://schemas.microsoft.com/office/drawing/2016/5/11/chartex" xmlns:cx6="http://schemas.microsoft.com/office/drawing/2016/5/12/chartex" xmlns:cx7="http://schemas.microsoft.com/office/drawing/2016/5/13/chartex" xmlns:cx8="http://schemas.microsoft.com/office/drawing/2016/5/14/chartex" xmlns:mc="http://schemas.openxmlformats.org/markup-compatibility/2006" xmlns:aink="http://schemas.microsoft.com/office/drawing/2016/ink" xmlns:am3d="http://schemas.microsoft.com/office/drawing/2017/model3d" xmlns:o="urn:schemas-microsoft-com:office:office" xmlns:oel="http://schemas.microsoft.com/office/2019/extlst" xmlns:r="http://schemas.openxmlformats.org/officeDocument/2006/relationships" xmlns:m="http://schemas.openxmlformats.org/officeDocument/2006/math" xmlns:v="urn:schemas-microsoft-com:vml" xmlns:wp14="http://schemas.microsoft.com/office/word/2010/wordprocessingDrawing" xmlns:wp="http://schemas.openxmlformats.org/drawingml/2006/wordprocessingDrawing" xmlns:w10="urn:schemas-microsoft-com:office:word" xmlns:w="http://schemas.openxmlformats.org/wordprocessingml/2006/main" xmlns:w14="http://schemas.microsoft.com/office/word/2010/wordml" xmlns:w15="http://schemas.microsoft.com/office/word/2012/wordml" xmlns:w16cex="http://schemas.microsoft.com/office/word/2018/wordml/cex" xmlns:w16cid="http://schemas.microsoft.com/office/word/2016/wordml/cid" xmlns:w16="http://schemas.microsoft.com/office/word/2018/wordml" xmlns:w16du="http://schemas.microsoft.com/office/word/2023/wordml/word16du" xmlns:w16sdtdh="http://schemas.microsoft.com/office/word/2020/wordml/sdtdatahash" xmlns:w16sdtfl="http://schemas.microsoft.com/office/word/2024/wordml/sdtformatlock" xmlns:w16se="http://schemas.microsoft.com/office/word/2015/wordml/symex" xmlns:wpg="http://schemas.microsoft.com/office/word/2010/wordprocessingGroup" xmlns:wpi="http://schemas.microsoft.com/office/word/2010/wordprocessingInk" xmlns:wne="http://schemas.microsoft.com/office/word/2006/wordml" xmlns:wps="http://schemas.microsoft.com/office/word/2010/wordprocessingShape" mc:Ignorable="w14 w15 w16se w16cid w16 w16cex w16sdtdh w16sdtfl w16du wp14">
+<w:hdr xmlns:w="http://schemas.openxmlformats.org/wordprocessingml/2006/main" xmlns:r="http://schemas.openxmlformats.org/officeDocument/2006/relationships" xmlns:mc="http://schemas.openxmlformats.org/markup-compatibility/2006" mc:Ignorable="w14 w15 w16se w16cid w16 w16cex w16sdtdh w16sdtfl w16du wp14">
   <w:p>
     <w:pPr>
       <w:pStyle w:val="Header"/>
+      <w:tabStops>
+        <w:tab w:val="right" w:pos="10560"/>
+      </w:tabStops>
+      <w:pBdr>
+        <w:bottom w:val="single" w:sz="4" w:space="1" w:color="CCCCCC"/>
+      </w:pBdr>
     </w:pPr>
+    <w:r>
+      <w:rPr>
+        <w:b/>
+        <w:sz w:val="16"/>
+        <w:color w:val="333333"/>
+      </w:rPr>
+      <w:t>{name}</w:t>
+    </w:r>
+    <w:r>
+      <w:tab/>
+    </w:r>
+    <w:r>
+      <w:fldChar w:fldCharType="begin"/>
+    </w:r>
+    <w:r>
+      <w:instrText xml:space="preserve"> PAGE </w:instrText>
+    </w:r>
+    <w:r>
+      <w:fldChar w:fldCharType="separate"/>
+    </w:r>
+    <w:r>
+      <w:rPr>
+        <w:sz w:val="16"/>
+        <w:color w:val="666666"/>
+      </w:rPr>
+      <w:t>1</w:t>
+    </w:r>
+    <w:r>
+      <w:fldChar w:fldCharType="end"/>
+    </w:r>
   </w:p>
 </w:hdr>
 </file>
 
 <file path=word/header2.xml><?xml version="1.0" encoding="utf-8"?>
-<w:hdr xmlns:wpc="http://schemas.microsoft.com/office/word/2010/wordprocessingCanvas" xmlns:cx="http://schemas.microsoft.com/office/drawing/2014/chartex" xmlns:cx1="http://schemas.microsoft.com/office/drawing/2015/9/8/chartex" xmlns:cx2="http://schemas.microsoft.com/office/drawing/2015/10/21/chartex" xmlns:cx3="http://schemas.microsoft.com/office/drawing/2016/5/9/chartex" xmlns:cx4="http://schemas.microsoft.com/office/drawing/2016/5/10/chartex" xmlns:cx5="http://schemas.microsoft.com/office/drawing/2016/5/11/chartex" xmlns:cx6="http://schemas.microsoft.com/office/drawing/2016/5/12/chartex" xmlns:cx7="http://schemas.microsoft.com/office/drawing/2016/5/13/chartex" xmlns:cx8="http://schemas.microsoft.com/office/drawing/2016/5/14/chartex" xmlns:mc="http://schemas.openxmlformats.org/markup-compatibility/2006" xmlns:aink="http://schemas.microsoft.com/office/drawing/2016/ink" xmlns:am3d="http://schemas.microsoft.com/office/drawing/2017/model3d" xmlns:o="urn:schemas-microsoft-com:office:office" xmlns:oel="http://schemas.microsoft.com/office/2019/extlst" xmlns:r="http://schemas.openxmlformats.org/officeDocument/2006/relationships" xmlns:m="http://schemas.openxmlformats.org/officeDocument/2006/math" xmlns:v="urn:schemas-microsoft-com:vml" xmlns:wp14="http://schemas.microsoft.com/office/word/2010/wordprocessingDrawing" xmlns:wp="http://schemas.openxmlformats.org/drawingml/2006/wordprocessingDrawing" xmlns:w10="urn:schemas-microsoft-com:office:word" xmlns:w="http://schemas.openxmlformats.org/wordprocessingml/2006/main" xmlns:w14="http://schemas.microsoft.com/office/word/2010/wordml" xmlns:w15="http://schemas.microsoft.com/office/word/2012/wordml" xmlns:w16cex="http://schemas.microsoft.com/office/word/2018/wordml/cex" xmlns:w16cid="http://schemas.microsoft.com/office/word/2016/wordml/cid" xmlns:w16="http://schemas.microsoft.com/office/word/2018/wordml" xmlns:w16du="http://schemas.microsoft.com/office/word/2023/wordml/word16du" xmlns:w16sdtdh="http://schemas.microsoft.com/office/word/2020/wordml/sdtdatahash" xmlns:w16sdtfl="http://schemas.microsoft.com/office/word/2024/wordml/sdtformatlock" xmlns:w16se="http://schemas.microsoft.com/office/word/2015/wordml/symex" xmlns:wpg="http://schemas.microsoft.com/office/word/2010/wordprocessingGroup" xmlns:wpi="http://schemas.microsoft.com/office/word/2010/wordprocessingInk" xmlns:wne="http://schemas.microsoft.com/office/word/2006/wordml" xmlns:wps="http://schemas.microsoft.com/office/word/2010/wordprocessingShape" mc:Ignorable="w14 w15 w16se w16cid w16 w16cex w16sdtdh w16sdtfl w16du wp14">
+<w:hdr xmlns:w="http://schemas.openxmlformats.org/wordprocessingml/2006/main" xmlns:r="http://schemas.openxmlformats.org/officeDocument/2006/relationships" xmlns:mc="http://schemas.openxmlformats.org/markup-compatibility/2006" mc:Ignorable="w14 w15 w16se w16cid w16 w16cex w16sdtdh w16sdtfl w16du wp14">
   <w:p>
     <w:pPr>
       <w:pStyle w:val="Header"/>
-      <w:rPr>
-        <w:color w:val="FF0000"/>
-      </w:rPr>
+      <w:tabStops>
+        <w:tab w:val="right" w:pos="10560"/>
+      </w:tabStops>
+      <w:pBdr>
+        <w:bottom w:val="single" w:sz="4" w:space="1" w:color="CCCCCC"/>
+      </w:pBdr>
     </w:pPr>
+    <w:r>
+      <w:rPr>
+        <w:b/>
+        <w:sz w:val="16"/>
+        <w:color w:val="333333"/>
+      </w:rPr>
+      <w:t>{name}</w:t>
+    </w:r>
+    <w:r>
+      <w:tab/>
+    </w:r>
+    <w:r>
+      <w:fldChar w:fldCharType="begin"/>
+    </w:r>
+    <w:r>
+      <w:instrText xml:space="preserve"> PAGE </w:instrText>
+    </w:r>
+    <w:r>
+      <w:fldChar w:fldCharType="separate"/>
+    </w:r>
+    <w:r>
+      <w:rPr>
+        <w:sz w:val="16"/>
+        <w:color w:val="666666"/>
+      </w:rPr>
+      <w:t>1</w:t>
+    </w:r>
+    <w:r>
+      <w:fldChar w:fldCharType="end"/>
+    </w:r>
   </w:p>
 </w:hdr>
 </file>
 
 <file path=word/header3.xml><?xml version="1.0" encoding="utf-8"?>
-<w:hdr xmlns:wpc="http://schemas.microsoft.com/office/word/2010/wordprocessingCanvas" xmlns:cx="http://schemas.microsoft.com/office/drawing/2014/chartex" xmlns:cx1="http://schemas.microsoft.com/office/drawing/2015/9/8/chartex" xmlns:cx2="http://schemas.microsoft.com/office/drawing/2015/10/21/chartex" xmlns:cx3="http://schemas.microsoft.com/office/drawing/2016/5/9/chartex" xmlns:cx4="http://schemas.microsoft.com/office/drawing/2016/5/10/chartex" xmlns:cx5="http://schemas.microsoft.com/office/drawing/2016/5/11/chartex" xmlns:cx6="http://schemas.microsoft.com/office/drawing/2016/5/12/chartex" xmlns:cx7="http://schemas.microsoft.com/office/drawing/2016/5/13/chartex" xmlns:cx8="http://schemas.microsoft.com/office/drawing/2016/5/14/chartex" xmlns:mc="http://schemas.openxmlformats.org/markup-compatibility/2006" xmlns:aink="http://schemas.microsoft.com/office/drawing/2016/ink" xmlns:am3d="http://schemas.microsoft.com/office/drawing/2017/model3d" xmlns:o="urn:schemas-microsoft-com:office:office" xmlns:oel="http://schemas.microsoft.com/office/2019/extlst" xmlns:r="http://schemas.openxmlformats.org/officeDocument/2006/relationships" xmlns:m="http://schemas.openxmlformats.org/officeDocument/2006/math" xmlns:v="urn:schemas-microsoft-com:vml" xmlns:wp14="http://schemas.microsoft.com/office/word/2010/wordprocessingDrawing" xmlns:wp="http://schemas.openxmlformats.org/drawingml/2006/wordprocessingDrawing" xmlns:w10="urn:schemas-microsoft-com:office:word" xmlns:w="http://schemas.openxmlformats.org/wordprocessingml/2006/main" xmlns:w14="http://schemas.microsoft.com/office/word/2010/wordml" xmlns:w15="http://schemas.microsoft.com/office/word/2012/wordml" xmlns:w16cex="http://schemas.microsoft.com/office/word/2018/wordml/cex" xmlns:w16cid="http://schemas.microsoft.com/office/word/2016/wordml/cid" xmlns:w16="http://schemas.microsoft.com/office/word/2018/wordml" xmlns:w16du="http://schemas.microsoft.com/office/word/2023/wordml/word16du" xmlns:w16sdtdh="http://schemas.microsoft.com/office/word/2020/wordml/sdtdatahash" xmlns:w16sdtfl="http://schemas.microsoft.com/office/word/2024/wordml/sdtformatlock" xmlns:w16se="http://schemas.microsoft.com/office/word/2015/wordml/symex" xmlns:wpg="http://schemas.microsoft.com/office/word/2010/wordprocessingGroup" xmlns:wpi="http://schemas.microsoft.com/office/word/2010/wordprocessingInk" xmlns:wne="http://schemas.microsoft.com/office/word/2006/wordml" xmlns:wps="http://schemas.microsoft.com/office/word/2010/wordprocessingShape" mc:Ignorable="w14 w15 w16se w16cid w16 w16cex w16sdtdh w16sdtfl w16du wp14">
+<w:hdr xmlns:w="http://schemas.openxmlformats.org/wordprocessingml/2006/main" xmlns:r="http://schemas.openxmlformats.org/officeDocument/2006/relationships" xmlns:mc="http://schemas.openxmlformats.org/markup-compatibility/2006" mc:Ignorable="w14 w15 w16se w16cid w16 w16cex w16sdtdh w16sdtfl w16du wp14">
   <w:p>
     <w:pPr>
       <w:pStyle w:val="Header"/>
+      <w:tabStops>
+        <w:tab w:val="right" w:pos="10560"/>
+      </w:tabStops>
+      <w:pBdr>
+        <w:bottom w:val="single" w:sz="4" w:space="1" w:color="CCCCCC"/>
+      </w:pBdr>
     </w:pPr>
+    <w:r>
+      <w:rPr>
+        <w:b/>
+        <w:sz w:val="16"/>
+        <w:color w:val="333333"/>
+      </w:rPr>
+      <w:t>{name}</w:t>
+    </w:r>
+    <w:r>
+      <w:tab/>
+    </w:r>
+    <w:r>
+      <w:fldChar w:fldCharType="begin"/>
+    </w:r>
+    <w:r>
+      <w:instrText xml:space="preserve"> PAGE </w:instrText>
+    </w:r>
+    <w:r>
+      <w:fldChar w:fldCharType="separate"/>
+    </w:r>
+    <w:r>
+      <w:rPr>
+        <w:sz w:val="16"/>
+        <w:color w:val="666666"/>
+      </w:rPr>
+      <w:t>1</w:t>
+    </w:r>
+    <w:r>
+      <w:fldChar w:fldCharType="end"/>
+    </w:r>
   </w:p>
 </w:hdr>
 </file>

</xml_diff>

<commit_message>
Add page 2 top spacer to prevent corner overlay overlap
- Add default header with one-line spacer on page 2+ (empty first-page header)
- Bump w:top by 240 twips in post-process so body text clears the overlay
- Keep borderless textbox (filled/stroked off) and footer-only overlay carrier
- Update template patch script to match v2/v3 builder behavior

Co-authored-by: MarkAlanBrest <MarkAlanBrest@users.noreply.github.com>
</commit_message>
<xml_diff>
--- a/public/templates/TemplateA.docx
+++ b/public/templates/TemplateA.docx
@@ -1776,14 +1776,12 @@
       </w:pPr>
     </w:p>
     <w:sectPr>
-      <w:headerReference w:type="even" r:id="rId7"/>
-      <w:headerReference w:type="default" r:id="rId8"/>
-      <w:footerReference w:type="even" r:id="rId9"/>
-      <w:footerReference w:type="default" r:id="rId10"/>
-      <w:headerReference w:type="first" r:id="rId11"/>
-      <w:footerReference w:type="first" r:id="rId12"/>
+      <w:headerReference w:type="first" r:id="rId16"/>
+      <w:headerReference w:type="default" r:id="rId15"/>
+      <w:footerReference w:type="first" r:id="rId18"/>
+      <w:footerReference w:type="default" r:id="rId17"/>
       <w:pgSz w:w="12240" w:h="15840"/>
-      <w:pgMar w:top="720" w:right="720" w:bottom="720" w:left="720" w:header="720" w:footer="720" w:gutter="0"/>
+      <w:pgMar w:top="960" w:right="720" w:bottom="720" w:left="720" w:header="0" w:footer="0" w:gutter="0"/>
       <w:pgBorders w:offsetFrom="page">
         <w:top w:val="thinThickLargeGap" w:sz="24" w:space="24" w:color="943634" w:themeColor="accent2" w:themeShade="BF"/>
         <w:left w:val="thinThickLargeGap" w:sz="24" w:space="24" w:color="943634" w:themeColor="accent2" w:themeShade="BF"/>
@@ -1819,23 +1817,67 @@
 </file>
 
 <file path=word/footer1.xml><?xml version="1.0" encoding="utf-8"?>
-<w:ftr xmlns:wpc="http://schemas.microsoft.com/office/word/2010/wordprocessingCanvas" xmlns:cx="http://schemas.microsoft.com/office/drawing/2014/chartex" xmlns:cx1="http://schemas.microsoft.com/office/drawing/2015/9/8/chartex" xmlns:cx2="http://schemas.microsoft.com/office/drawing/2015/10/21/chartex" xmlns:cx3="http://schemas.microsoft.com/office/drawing/2016/5/9/chartex" xmlns:cx4="http://schemas.microsoft.com/office/drawing/2016/5/10/chartex" xmlns:cx5="http://schemas.microsoft.com/office/drawing/2016/5/11/chartex" xmlns:cx6="http://schemas.microsoft.com/office/drawing/2016/5/12/chartex" xmlns:cx7="http://schemas.microsoft.com/office/drawing/2016/5/13/chartex" xmlns:cx8="http://schemas.microsoft.com/office/drawing/2016/5/14/chartex" xmlns:mc="http://schemas.openxmlformats.org/markup-compatibility/2006" xmlns:aink="http://schemas.microsoft.com/office/drawing/2016/ink" xmlns:am3d="http://schemas.microsoft.com/office/drawing/2017/model3d" xmlns:o="urn:schemas-microsoft-com:office:office" xmlns:oel="http://schemas.microsoft.com/office/2019/extlst" xmlns:r="http://schemas.openxmlformats.org/officeDocument/2006/relationships" xmlns:m="http://schemas.openxmlformats.org/officeDocument/2006/math" xmlns:v="urn:schemas-microsoft-com:vml" xmlns:wp14="http://schemas.microsoft.com/office/word/2010/wordprocessingDrawing" xmlns:wp="http://schemas.openxmlformats.org/drawingml/2006/wordprocessingDrawing" xmlns:w10="urn:schemas-microsoft-com:office:word" xmlns:w="http://schemas.openxmlformats.org/wordprocessingml/2006/main" xmlns:w14="http://schemas.microsoft.com/office/word/2010/wordml" xmlns:w15="http://schemas.microsoft.com/office/word/2012/wordml" xmlns:w16cex="http://schemas.microsoft.com/office/word/2018/wordml/cex" xmlns:w16cid="http://schemas.microsoft.com/office/word/2016/wordml/cid" xmlns:w16="http://schemas.microsoft.com/office/word/2018/wordml" xmlns:w16du="http://schemas.microsoft.com/office/word/2023/wordml/word16du" xmlns:w16sdtdh="http://schemas.microsoft.com/office/word/2020/wordml/sdtdatahash" xmlns:w16sdtfl="http://schemas.microsoft.com/office/word/2024/wordml/sdtformatlock" xmlns:w16se="http://schemas.microsoft.com/office/word/2015/wordml/symex" xmlns:wpg="http://schemas.microsoft.com/office/word/2010/wordprocessingGroup" xmlns:wpi="http://schemas.microsoft.com/office/word/2010/wordprocessingInk" xmlns:wne="http://schemas.microsoft.com/office/word/2006/wordml" xmlns:wps="http://schemas.microsoft.com/office/word/2010/wordprocessingShape" mc:Ignorable="w14 w15 w16se w16cid w16 w16cex w16sdtdh w16sdtfl w16du wp14">
+<w:ftr xmlns:w="http://schemas.openxmlformats.org/wordprocessingml/2006/main" xmlns:r="http://schemas.openxmlformats.org/officeDocument/2006/relationships" xmlns:v="urn:schemas-microsoft-com:vml" xmlns:o="urn:schemas-microsoft-com:office:office" xmlns:mc="http://schemas.openxmlformats.org/markup-compatibility/2006" mc:Ignorable="w14 w15 w16se w16cid w16 w16cex w16sdtdh w16sdtfl w16du wp14">
   <w:p>
     <w:pPr>
-      <w:pStyle w:val="Footer"/>
+      <w:spacing w:before="0" w:after="0"/>
     </w:pPr>
+    <w:pict>
+      <v:shape id="cornerMarkerOverlay" o:spid="_x0000_s1026" type="#_x0000_t202" filled="f" stroked="f" style="width:2.75in;height:0.55in;position:absolute;mso-position-horizontal-relative:page;mso-position-horizontal:right;margin-right:0.35in;mso-position-vertical-relative:page;top:0.18in;mso-wrap-style:none">
+        <v:textbox style="mso-fit-shape-to-text:t;" insetmode="auto">
+          <w:txbxContent>
+            <w:p>
+              <w:pPr>
+                <w:spacing w:before="0" w:after="0"/>
+                <w:jc w:val="right"/>
+              </w:pPr>
+              <w:r>
+                <w:rPr>
+                  <w:sz w:val="14"/>
+                  <w:color w:val="666666"/>
+                </w:rPr>
+                <w:t>{name}</w:t>
+              </w:r>
+              <w:r>
+                <w:br/>
+              </w:r>
+              <w:r>
+                <w:rPr>
+                  <w:sz w:val="14"/>
+                  <w:color w:val="999999"/>
+                </w:rPr>
+                <w:t>Page </w:t>
+              </w:r>
+              <w:r>
+                <w:fldChar w:fldCharType="begin"/>
+              </w:r>
+              <w:r>
+                <w:instrText xml:space="preserve"> PAGE </w:instrText>
+              </w:r>
+              <w:r>
+                <w:fldChar w:fldCharType="separate"/>
+              </w:r>
+              <w:r>
+                <w:rPr>
+                  <w:sz w:val="14"/>
+                  <w:color w:val="999999"/>
+                </w:rPr>
+                <w:t>1</w:t>
+              </w:r>
+              <w:r>
+                <w:fldChar w:fldCharType="end"/>
+              </w:r>
+            </w:p>
+          </w:txbxContent>
+        </v:textbox>
+      </v:shape>
+    </w:pict>
   </w:p>
 </w:ftr>
 </file>
 
 <file path=word/footer2.xml><?xml version="1.0" encoding="utf-8"?>
-<w:ftr xmlns:wpc="http://schemas.microsoft.com/office/word/2010/wordprocessingCanvas" xmlns:cx="http://schemas.microsoft.com/office/drawing/2014/chartex" xmlns:cx1="http://schemas.microsoft.com/office/drawing/2015/9/8/chartex" xmlns:cx2="http://schemas.microsoft.com/office/drawing/2015/10/21/chartex" xmlns:cx3="http://schemas.microsoft.com/office/drawing/2016/5/9/chartex" xmlns:cx4="http://schemas.microsoft.com/office/drawing/2016/5/10/chartex" xmlns:cx5="http://schemas.microsoft.com/office/drawing/2016/5/11/chartex" xmlns:cx6="http://schemas.microsoft.com/office/drawing/2016/5/12/chartex" xmlns:cx7="http://schemas.microsoft.com/office/drawing/2016/5/13/chartex" xmlns:cx8="http://schemas.microsoft.com/office/drawing/2016/5/14/chartex" xmlns:mc="http://schemas.openxmlformats.org/markup-compatibility/2006" xmlns:aink="http://schemas.microsoft.com/office/drawing/2016/ink" xmlns:am3d="http://schemas.microsoft.com/office/drawing/2017/model3d" xmlns:o="urn:schemas-microsoft-com:office:office" xmlns:oel="http://schemas.microsoft.com/office/2019/extlst" xmlns:r="http://schemas.openxmlformats.org/officeDocument/2006/relationships" xmlns:m="http://schemas.openxmlformats.org/officeDocument/2006/math" xmlns:v="urn:schemas-microsoft-com:vml" xmlns:wp14="http://schemas.microsoft.com/office/word/2010/wordprocessingDrawing" xmlns:wp="http://schemas.openxmlformats.org/drawingml/2006/wordprocessingDrawing" xmlns:w10="urn:schemas-microsoft-com:office:word" xmlns:w="http://schemas.openxmlformats.org/wordprocessingml/2006/main" xmlns:w14="http://schemas.microsoft.com/office/word/2010/wordml" xmlns:w15="http://schemas.microsoft.com/office/word/2012/wordml" xmlns:w16cex="http://schemas.microsoft.com/office/word/2018/wordml/cex" xmlns:w16cid="http://schemas.microsoft.com/office/word/2016/wordml/cid" xmlns:w16="http://schemas.microsoft.com/office/word/2018/wordml" xmlns:w16du="http://schemas.microsoft.com/office/word/2023/wordml/word16du" xmlns:w16sdtdh="http://schemas.microsoft.com/office/word/2020/wordml/sdtdatahash" xmlns:w16sdtfl="http://schemas.microsoft.com/office/word/2024/wordml/sdtformatlock" xmlns:w16se="http://schemas.microsoft.com/office/word/2015/wordml/symex" xmlns:wpg="http://schemas.microsoft.com/office/word/2010/wordprocessingGroup" xmlns:wpi="http://schemas.microsoft.com/office/word/2010/wordprocessingInk" xmlns:wne="http://schemas.microsoft.com/office/word/2006/wordml" xmlns:wps="http://schemas.microsoft.com/office/word/2010/wordprocessingShape" mc:Ignorable="w14 w15 w16se w16cid w16 w16cex w16sdtdh w16sdtfl w16du wp14">
-  <w:p>
-    <w:pPr>
-      <w:pStyle w:val="Footer"/>
-    </w:pPr>
-  </w:p>
-</w:ftr>
+<w:ftr xmlns:w="http://schemas.openxmlformats.org/wordprocessingml/2006/main"/>
 </file>
 
 <file path=word/footer3.xml><?xml version="1.0" encoding="utf-8"?>
@@ -1868,141 +1910,23 @@
 </file>
 
 <file path=word/header1.xml><?xml version="1.0" encoding="utf-8"?>
-<w:hdr xmlns:w="http://schemas.openxmlformats.org/wordprocessingml/2006/main" xmlns:r="http://schemas.openxmlformats.org/officeDocument/2006/relationships" xmlns:mc="http://schemas.openxmlformats.org/markup-compatibility/2006" mc:Ignorable="w14 w15 w16se w16cid w16 w16cex w16sdtdh w16sdtfl w16du wp14">
+<w:hdr xmlns:w="http://schemas.openxmlformats.org/wordprocessingml/2006/main">
   <w:p>
     <w:pPr>
-      <w:pStyle w:val="Header"/>
-      <w:tabStops>
-        <w:tab w:val="right" w:pos="10560"/>
-      </w:tabStops>
-      <w:pBdr>
-        <w:bottom w:val="single" w:sz="4" w:space="1" w:color="CCCCCC"/>
-      </w:pBdr>
+      <w:spacing w:before="0" w:after="240"/>
     </w:pPr>
     <w:r>
       <w:rPr>
-        <w:b/>
-        <w:sz w:val="16"/>
-        <w:color w:val="333333"/>
-      </w:rPr>
-      <w:t>{name}</w:t>
-    </w:r>
-    <w:r>
-      <w:tab/>
-    </w:r>
-    <w:r>
-      <w:fldChar w:fldCharType="begin"/>
-    </w:r>
-    <w:r>
-      <w:instrText xml:space="preserve"> PAGE </w:instrText>
-    </w:r>
-    <w:r>
-      <w:fldChar w:fldCharType="separate"/>
-    </w:r>
-    <w:r>
-      <w:rPr>
-        <w:sz w:val="16"/>
-        <w:color w:val="666666"/>
-      </w:rPr>
-      <w:t>1</w:t>
-    </w:r>
-    <w:r>
-      <w:fldChar w:fldCharType="end"/>
+        <w:sz w:val="2"/>
+      </w:rPr>
+      <w:t/>
     </w:r>
   </w:p>
 </w:hdr>
 </file>
 
 <file path=word/header2.xml><?xml version="1.0" encoding="utf-8"?>
-<w:hdr xmlns:w="http://schemas.openxmlformats.org/wordprocessingml/2006/main" xmlns:r="http://schemas.openxmlformats.org/officeDocument/2006/relationships" xmlns:mc="http://schemas.openxmlformats.org/markup-compatibility/2006" mc:Ignorable="w14 w15 w16se w16cid w16 w16cex w16sdtdh w16sdtfl w16du wp14">
-  <w:p>
-    <w:pPr>
-      <w:pStyle w:val="Header"/>
-      <w:tabStops>
-        <w:tab w:val="right" w:pos="10560"/>
-      </w:tabStops>
-      <w:pBdr>
-        <w:bottom w:val="single" w:sz="4" w:space="1" w:color="CCCCCC"/>
-      </w:pBdr>
-    </w:pPr>
-    <w:r>
-      <w:rPr>
-        <w:b/>
-        <w:sz w:val="16"/>
-        <w:color w:val="333333"/>
-      </w:rPr>
-      <w:t>{name}</w:t>
-    </w:r>
-    <w:r>
-      <w:tab/>
-    </w:r>
-    <w:r>
-      <w:fldChar w:fldCharType="begin"/>
-    </w:r>
-    <w:r>
-      <w:instrText xml:space="preserve"> PAGE </w:instrText>
-    </w:r>
-    <w:r>
-      <w:fldChar w:fldCharType="separate"/>
-    </w:r>
-    <w:r>
-      <w:rPr>
-        <w:sz w:val="16"/>
-        <w:color w:val="666666"/>
-      </w:rPr>
-      <w:t>1</w:t>
-    </w:r>
-    <w:r>
-      <w:fldChar w:fldCharType="end"/>
-    </w:r>
-  </w:p>
-</w:hdr>
-</file>
-
-<file path=word/header3.xml><?xml version="1.0" encoding="utf-8"?>
-<w:hdr xmlns:w="http://schemas.openxmlformats.org/wordprocessingml/2006/main" xmlns:r="http://schemas.openxmlformats.org/officeDocument/2006/relationships" xmlns:mc="http://schemas.openxmlformats.org/markup-compatibility/2006" mc:Ignorable="w14 w15 w16se w16cid w16 w16cex w16sdtdh w16sdtfl w16du wp14">
-  <w:p>
-    <w:pPr>
-      <w:pStyle w:val="Header"/>
-      <w:tabStops>
-        <w:tab w:val="right" w:pos="10560"/>
-      </w:tabStops>
-      <w:pBdr>
-        <w:bottom w:val="single" w:sz="4" w:space="1" w:color="CCCCCC"/>
-      </w:pBdr>
-    </w:pPr>
-    <w:r>
-      <w:rPr>
-        <w:b/>
-        <w:sz w:val="16"/>
-        <w:color w:val="333333"/>
-      </w:rPr>
-      <w:t>{name}</w:t>
-    </w:r>
-    <w:r>
-      <w:tab/>
-    </w:r>
-    <w:r>
-      <w:fldChar w:fldCharType="begin"/>
-    </w:r>
-    <w:r>
-      <w:instrText xml:space="preserve"> PAGE </w:instrText>
-    </w:r>
-    <w:r>
-      <w:fldChar w:fldCharType="separate"/>
-    </w:r>
-    <w:r>
-      <w:rPr>
-        <w:sz w:val="16"/>
-        <w:color w:val="666666"/>
-      </w:rPr>
-      <w:t>1</w:t>
-    </w:r>
-    <w:r>
-      <w:fldChar w:fldCharType="end"/>
-    </w:r>
-  </w:p>
-</w:hdr>
+<w:hdr xmlns:w="http://schemas.openxmlformats.org/wordprocessingml/2006/main"/>
 </file>
 
 <file path=word/numbering.xml><?xml version="1.0" encoding="utf-8"?>

</xml_diff>

<commit_message>
Improve corner overlay contrast on colored resume bars
- Use bold dark text (#222222 / #444444) instead of light gray
- Add borderless white textbox fill so label stays readable on accent bars
- Update template patch script and re-patch all Template*.docx files

Co-authored-by: MarkAlanBrest <MarkAlanBrest@users.noreply.github.com>
</commit_message>
<xml_diff>
--- a/public/templates/TemplateA.docx
+++ b/public/templates/TemplateA.docx
@@ -1781,7 +1781,7 @@
       <w:footerReference w:type="first" r:id="rId18"/>
       <w:footerReference w:type="default" r:id="rId17"/>
       <w:pgSz w:w="12240" w:h="15840"/>
-      <w:pgMar w:top="960" w:right="720" w:bottom="720" w:left="720" w:header="0" w:footer="0" w:gutter="0"/>
+      <w:pgMar w:top="1200" w:right="720" w:bottom="720" w:left="720" w:header="0" w:footer="0" w:gutter="0"/>
       <w:pgBorders w:offsetFrom="page">
         <w:top w:val="thinThickLargeGap" w:sz="24" w:space="24" w:color="943634" w:themeColor="accent2" w:themeShade="BF"/>
         <w:left w:val="thinThickLargeGap" w:sz="24" w:space="24" w:color="943634" w:themeColor="accent2" w:themeShade="BF"/>
@@ -1823,7 +1823,7 @@
       <w:spacing w:before="0" w:after="0"/>
     </w:pPr>
     <w:pict>
-      <v:shape id="cornerMarkerOverlay" o:spid="_x0000_s1026" type="#_x0000_t202" filled="f" stroked="f" style="width:2.75in;height:0.55in;position:absolute;mso-position-horizontal-relative:page;mso-position-horizontal:right;margin-right:0.35in;mso-position-vertical-relative:page;top:0.18in;mso-wrap-style:none">
+      <v:shape id="cornerMarkerOverlay" o:spid="_x0000_s1026" type="#_x0000_t202" filled="t" fillcolor="#FFFFFF" stroked="f" style="width:2.75in;height:0.55in;position:absolute;mso-position-horizontal-relative:page;mso-position-horizontal:right;margin-right:0.35in;mso-position-vertical-relative:page;top:0.18in;mso-wrap-style:none">
         <v:textbox style="mso-fit-shape-to-text:t;" insetmode="auto">
           <w:txbxContent>
             <w:p>
@@ -1833,8 +1833,9 @@
               </w:pPr>
               <w:r>
                 <w:rPr>
+                  <w:b/>
                   <w:sz w:val="14"/>
-                  <w:color w:val="666666"/>
+                  <w:color w:val="222222"/>
                 </w:rPr>
                 <w:t>{name}</w:t>
               </w:r>
@@ -1843,8 +1844,9 @@
               </w:r>
               <w:r>
                 <w:rPr>
+                  <w:b/>
                   <w:sz w:val="14"/>
-                  <w:color w:val="999999"/>
+                  <w:color w:val="444444"/>
                 </w:rPr>
                 <w:t>Page </w:t>
               </w:r>

</xml_diff>

<commit_message>
Revert to footer-only overlay on page 2+ with no page 1 header
Remove spacer headers, top margin bump, and white textbox fill.
Use titlePage with empty first-page footer and default footer overlay
so page 1 stays clean and name + Page N only appears from page 2 on.

Co-authored-by: MarkAlanBrest <MarkAlanBrest@users.noreply.github.com>
</commit_message>
<xml_diff>
--- a/public/templates/TemplateA.docx
+++ b/public/templates/TemplateA.docx
@@ -1776,8 +1776,6 @@
       </w:pPr>
     </w:p>
     <w:sectPr>
-      <w:headerReference w:type="first" r:id="rId16"/>
-      <w:headerReference w:type="default" r:id="rId15"/>
       <w:footerReference w:type="first" r:id="rId18"/>
       <w:footerReference w:type="default" r:id="rId17"/>
       <w:pgSz w:w="12240" w:h="15840"/>
@@ -1823,7 +1821,7 @@
       <w:spacing w:before="0" w:after="0"/>
     </w:pPr>
     <w:pict>
-      <v:shape id="cornerMarkerOverlay" o:spid="_x0000_s1026" type="#_x0000_t202" filled="t" fillcolor="#FFFFFF" stroked="f" style="width:2.75in;height:0.55in;position:absolute;mso-position-horizontal-relative:page;mso-position-horizontal:right;margin-right:0.35in;mso-position-vertical-relative:page;top:0.18in;mso-wrap-style:none">
+      <v:shape id="cornerMarkerOverlay" o:spid="_x0000_s1026" type="#_x0000_t202" filled="f" stroked="f" style="width:2.75in;height:0.55in;position:absolute;mso-position-horizontal-relative:page;mso-position-horizontal:right;margin-right:0.35in;mso-position-vertical-relative:page;top:0.12in;mso-wrap-style:none">
         <v:textbox style="mso-fit-shape-to-text:t;" insetmode="auto">
           <w:txbxContent>
             <w:p>
@@ -1833,9 +1831,8 @@
               </w:pPr>
               <w:r>
                 <w:rPr>
-                  <w:b/>
                   <w:sz w:val="14"/>
-                  <w:color w:val="222222"/>
+                  <w:color w:val="666666"/>
                 </w:rPr>
                 <w:t>{name}</w:t>
               </w:r>
@@ -1844,9 +1841,8 @@
               </w:r>
               <w:r>
                 <w:rPr>
-                  <w:b/>
                   <w:sz w:val="14"/>
-                  <w:color w:val="444444"/>
+                  <w:color w:val="999999"/>
                 </w:rPr>
                 <w:t>Page </w:t>
               </w:r>
@@ -1909,26 +1905,6 @@
     </w:p>
   </w:footnote>
 </w:footnotes>
-</file>
-
-<file path=word/header1.xml><?xml version="1.0" encoding="utf-8"?>
-<w:hdr xmlns:w="http://schemas.openxmlformats.org/wordprocessingml/2006/main">
-  <w:p>
-    <w:pPr>
-      <w:spacing w:before="0" w:after="240"/>
-    </w:pPr>
-    <w:r>
-      <w:rPr>
-        <w:sz w:val="2"/>
-      </w:rPr>
-      <w:t/>
-    </w:r>
-  </w:p>
-</w:hdr>
-</file>
-
-<file path=word/header2.xml><?xml version="1.0" encoding="utf-8"?>
-<w:hdr xmlns:w="http://schemas.openxmlformats.org/wordprocessingml/2006/main"/>
 </file>
 
 <file path=word/numbering.xml><?xml version="1.0" encoding="utf-8"?>

</xml_diff>

<commit_message>
Move page 2+ name/Page overlay from footer to header
- Post-process injects default header with floating VML textbox (name + Page N)
- Empty first-page header keeps page 1 clean; footers removed entirely
- Template patch script updated to match; all Template*.docx re-patched

Co-authored-by: MarkAlanBrest <MarkAlanBrest@users.noreply.github.com>
</commit_message>
<xml_diff>
--- a/public/templates/TemplateA.docx
+++ b/public/templates/TemplateA.docx
@@ -1776,8 +1776,8 @@
       </w:pPr>
     </w:p>
     <w:sectPr>
-      <w:footerReference w:type="first" r:id="rId18"/>
-      <w:footerReference w:type="default" r:id="rId17"/>
+      <w:headerReference w:type="first" r:id="rId16"/>
+      <w:headerReference w:type="default" r:id="rId15"/>
       <w:pgSz w:w="12240" w:h="15840"/>
       <w:pgMar w:top="1200" w:right="720" w:bottom="720" w:left="720" w:header="0" w:footer="0" w:gutter="0"/>
       <w:pgBorders w:offsetFrom="page">
@@ -1814,8 +1814,27 @@
 </w:endnotes>
 </file>
 
-<file path=word/footer1.xml><?xml version="1.0" encoding="utf-8"?>
-<w:ftr xmlns:w="http://schemas.openxmlformats.org/wordprocessingml/2006/main" xmlns:r="http://schemas.openxmlformats.org/officeDocument/2006/relationships" xmlns:v="urn:schemas-microsoft-com:vml" xmlns:o="urn:schemas-microsoft-com:office:office" xmlns:mc="http://schemas.openxmlformats.org/markup-compatibility/2006" mc:Ignorable="w14 w15 w16se w16cid w16 w16cex w16sdtdh w16sdtfl w16du wp14">
+<file path=word/footnotes.xml><?xml version="1.0" encoding="utf-8"?>
+<w:footnotes xmlns:wpc="http://schemas.microsoft.com/office/word/2010/wordprocessingCanvas" xmlns:cx="http://schemas.microsoft.com/office/drawing/2014/chartex" xmlns:cx1="http://schemas.microsoft.com/office/drawing/2015/9/8/chartex" xmlns:cx2="http://schemas.microsoft.com/office/drawing/2015/10/21/chartex" xmlns:cx3="http://schemas.microsoft.com/office/drawing/2016/5/9/chartex" xmlns:cx4="http://schemas.microsoft.com/office/drawing/2016/5/10/chartex" xmlns:cx5="http://schemas.microsoft.com/office/drawing/2016/5/11/chartex" xmlns:cx6="http://schemas.microsoft.com/office/drawing/2016/5/12/chartex" xmlns:cx7="http://schemas.microsoft.com/office/drawing/2016/5/13/chartex" xmlns:cx8="http://schemas.microsoft.com/office/drawing/2016/5/14/chartex" xmlns:mc="http://schemas.openxmlformats.org/markup-compatibility/2006" xmlns:aink="http://schemas.microsoft.com/office/drawing/2016/ink" xmlns:am3d="http://schemas.microsoft.com/office/drawing/2017/model3d" xmlns:o="urn:schemas-microsoft-com:office:office" xmlns:oel="http://schemas.microsoft.com/office/2019/extlst" xmlns:r="http://schemas.openxmlformats.org/officeDocument/2006/relationships" xmlns:m="http://schemas.openxmlformats.org/officeDocument/2006/math" xmlns:v="urn:schemas-microsoft-com:vml" xmlns:wp14="http://schemas.microsoft.com/office/word/2010/wordprocessingDrawing" xmlns:wp="http://schemas.openxmlformats.org/drawingml/2006/wordprocessingDrawing" xmlns:w10="urn:schemas-microsoft-com:office:word" xmlns:w="http://schemas.openxmlformats.org/wordprocessingml/2006/main" xmlns:w14="http://schemas.microsoft.com/office/word/2010/wordml" xmlns:w15="http://schemas.microsoft.com/office/word/2012/wordml" xmlns:w16cex="http://schemas.microsoft.com/office/word/2018/wordml/cex" xmlns:w16cid="http://schemas.microsoft.com/office/word/2016/wordml/cid" xmlns:w16="http://schemas.microsoft.com/office/word/2018/wordml" xmlns:w16du="http://schemas.microsoft.com/office/word/2023/wordml/word16du" xmlns:w16sdtdh="http://schemas.microsoft.com/office/word/2020/wordml/sdtdatahash" xmlns:w16sdtfl="http://schemas.microsoft.com/office/word/2024/wordml/sdtformatlock" xmlns:w16se="http://schemas.microsoft.com/office/word/2015/wordml/symex" xmlns:wpg="http://schemas.microsoft.com/office/word/2010/wordprocessingGroup" xmlns:wpi="http://schemas.microsoft.com/office/word/2010/wordprocessingInk" xmlns:wne="http://schemas.microsoft.com/office/word/2006/wordml" xmlns:wps="http://schemas.microsoft.com/office/word/2010/wordprocessingShape" mc:Ignorable="w14 w15 w16se w16cid w16 w16cex w16sdtdh w16sdtfl w16du wp14">
+  <w:footnote w:type="separator" w:id="-1">
+    <w:p>
+      <w:r>
+        <w:separator/>
+      </w:r>
+    </w:p>
+  </w:footnote>
+  <w:footnote w:type="continuationSeparator" w:id="0">
+    <w:p>
+      <w:r>
+        <w:continuationSeparator/>
+      </w:r>
+    </w:p>
+  </w:footnote>
+</w:footnotes>
+</file>
+
+<file path=word/header1.xml><?xml version="1.0" encoding="utf-8"?>
+<w:hdr xmlns:w="http://schemas.openxmlformats.org/wordprocessingml/2006/main" xmlns:r="http://schemas.openxmlformats.org/officeDocument/2006/relationships" xmlns:v="urn:schemas-microsoft-com:vml" xmlns:o="urn:schemas-microsoft-com:office:office" xmlns:mc="http://schemas.openxmlformats.org/markup-compatibility/2006" mc:Ignorable="w14 w15 w16se w16cid w16 w16cex w16sdtdh w16sdtfl w16du wp14">
   <w:p>
     <w:pPr>
       <w:spacing w:before="0" w:after="0"/>
@@ -1831,6 +1850,7 @@
               </w:pPr>
               <w:r>
                 <w:rPr>
+                  <w:b/>
                   <w:sz w:val="14"/>
                   <w:color w:val="666666"/>
                 </w:rPr>
@@ -1841,6 +1861,7 @@
               </w:r>
               <w:r>
                 <w:rPr>
+                  <w:b/>
                   <w:sz w:val="14"/>
                   <w:color w:val="999999"/>
                 </w:rPr>
@@ -1857,6 +1878,7 @@
               </w:r>
               <w:r>
                 <w:rPr>
+                  <w:b/>
                   <w:sz w:val="14"/>
                   <w:color w:val="999999"/>
                 </w:rPr>
@@ -1871,40 +1893,11 @@
       </v:shape>
     </w:pict>
   </w:p>
-</w:ftr>
+</w:hdr>
 </file>
 
-<file path=word/footer2.xml><?xml version="1.0" encoding="utf-8"?>
-<w:ftr xmlns:w="http://schemas.openxmlformats.org/wordprocessingml/2006/main"/>
-</file>
-
-<file path=word/footer3.xml><?xml version="1.0" encoding="utf-8"?>
-<w:ftr xmlns:wpc="http://schemas.microsoft.com/office/word/2010/wordprocessingCanvas" xmlns:cx="http://schemas.microsoft.com/office/drawing/2014/chartex" xmlns:cx1="http://schemas.microsoft.com/office/drawing/2015/9/8/chartex" xmlns:cx2="http://schemas.microsoft.com/office/drawing/2015/10/21/chartex" xmlns:cx3="http://schemas.microsoft.com/office/drawing/2016/5/9/chartex" xmlns:cx4="http://schemas.microsoft.com/office/drawing/2016/5/10/chartex" xmlns:cx5="http://schemas.microsoft.com/office/drawing/2016/5/11/chartex" xmlns:cx6="http://schemas.microsoft.com/office/drawing/2016/5/12/chartex" xmlns:cx7="http://schemas.microsoft.com/office/drawing/2016/5/13/chartex" xmlns:cx8="http://schemas.microsoft.com/office/drawing/2016/5/14/chartex" xmlns:mc="http://schemas.openxmlformats.org/markup-compatibility/2006" xmlns:aink="http://schemas.microsoft.com/office/drawing/2016/ink" xmlns:am3d="http://schemas.microsoft.com/office/drawing/2017/model3d" xmlns:o="urn:schemas-microsoft-com:office:office" xmlns:oel="http://schemas.microsoft.com/office/2019/extlst" xmlns:r="http://schemas.openxmlformats.org/officeDocument/2006/relationships" xmlns:m="http://schemas.openxmlformats.org/officeDocument/2006/math" xmlns:v="urn:schemas-microsoft-com:vml" xmlns:wp14="http://schemas.microsoft.com/office/word/2010/wordprocessingDrawing" xmlns:wp="http://schemas.openxmlformats.org/drawingml/2006/wordprocessingDrawing" xmlns:w10="urn:schemas-microsoft-com:office:word" xmlns:w="http://schemas.openxmlformats.org/wordprocessingml/2006/main" xmlns:w14="http://schemas.microsoft.com/office/word/2010/wordml" xmlns:w15="http://schemas.microsoft.com/office/word/2012/wordml" xmlns:w16cex="http://schemas.microsoft.com/office/word/2018/wordml/cex" xmlns:w16cid="http://schemas.microsoft.com/office/word/2016/wordml/cid" xmlns:w16="http://schemas.microsoft.com/office/word/2018/wordml" xmlns:w16du="http://schemas.microsoft.com/office/word/2023/wordml/word16du" xmlns:w16sdtdh="http://schemas.microsoft.com/office/word/2020/wordml/sdtdatahash" xmlns:w16sdtfl="http://schemas.microsoft.com/office/word/2024/wordml/sdtformatlock" xmlns:w16se="http://schemas.microsoft.com/office/word/2015/wordml/symex" xmlns:wpg="http://schemas.microsoft.com/office/word/2010/wordprocessingGroup" xmlns:wpi="http://schemas.microsoft.com/office/word/2010/wordprocessingInk" xmlns:wne="http://schemas.microsoft.com/office/word/2006/wordml" xmlns:wps="http://schemas.microsoft.com/office/word/2010/wordprocessingShape" mc:Ignorable="w14 w15 w16se w16cid w16 w16cex w16sdtdh w16sdtfl w16du wp14">
-  <w:p>
-    <w:pPr>
-      <w:pStyle w:val="Footer"/>
-    </w:pPr>
-  </w:p>
-</w:ftr>
-</file>
-
-<file path=word/footnotes.xml><?xml version="1.0" encoding="utf-8"?>
-<w:footnotes xmlns:wpc="http://schemas.microsoft.com/office/word/2010/wordprocessingCanvas" xmlns:cx="http://schemas.microsoft.com/office/drawing/2014/chartex" xmlns:cx1="http://schemas.microsoft.com/office/drawing/2015/9/8/chartex" xmlns:cx2="http://schemas.microsoft.com/office/drawing/2015/10/21/chartex" xmlns:cx3="http://schemas.microsoft.com/office/drawing/2016/5/9/chartex" xmlns:cx4="http://schemas.microsoft.com/office/drawing/2016/5/10/chartex" xmlns:cx5="http://schemas.microsoft.com/office/drawing/2016/5/11/chartex" xmlns:cx6="http://schemas.microsoft.com/office/drawing/2016/5/12/chartex" xmlns:cx7="http://schemas.microsoft.com/office/drawing/2016/5/13/chartex" xmlns:cx8="http://schemas.microsoft.com/office/drawing/2016/5/14/chartex" xmlns:mc="http://schemas.openxmlformats.org/markup-compatibility/2006" xmlns:aink="http://schemas.microsoft.com/office/drawing/2016/ink" xmlns:am3d="http://schemas.microsoft.com/office/drawing/2017/model3d" xmlns:o="urn:schemas-microsoft-com:office:office" xmlns:oel="http://schemas.microsoft.com/office/2019/extlst" xmlns:r="http://schemas.openxmlformats.org/officeDocument/2006/relationships" xmlns:m="http://schemas.openxmlformats.org/officeDocument/2006/math" xmlns:v="urn:schemas-microsoft-com:vml" xmlns:wp14="http://schemas.microsoft.com/office/word/2010/wordprocessingDrawing" xmlns:wp="http://schemas.openxmlformats.org/drawingml/2006/wordprocessingDrawing" xmlns:w10="urn:schemas-microsoft-com:office:word" xmlns:w="http://schemas.openxmlformats.org/wordprocessingml/2006/main" xmlns:w14="http://schemas.microsoft.com/office/word/2010/wordml" xmlns:w15="http://schemas.microsoft.com/office/word/2012/wordml" xmlns:w16cex="http://schemas.microsoft.com/office/word/2018/wordml/cex" xmlns:w16cid="http://schemas.microsoft.com/office/word/2016/wordml/cid" xmlns:w16="http://schemas.microsoft.com/office/word/2018/wordml" xmlns:w16du="http://schemas.microsoft.com/office/word/2023/wordml/word16du" xmlns:w16sdtdh="http://schemas.microsoft.com/office/word/2020/wordml/sdtdatahash" xmlns:w16sdtfl="http://schemas.microsoft.com/office/word/2024/wordml/sdtformatlock" xmlns:w16se="http://schemas.microsoft.com/office/word/2015/wordml/symex" xmlns:wpg="http://schemas.microsoft.com/office/word/2010/wordprocessingGroup" xmlns:wpi="http://schemas.microsoft.com/office/word/2010/wordprocessingInk" xmlns:wne="http://schemas.microsoft.com/office/word/2006/wordml" xmlns:wps="http://schemas.microsoft.com/office/word/2010/wordprocessingShape" mc:Ignorable="w14 w15 w16se w16cid w16 w16cex w16sdtdh w16sdtfl w16du wp14">
-  <w:footnote w:type="separator" w:id="-1">
-    <w:p>
-      <w:r>
-        <w:separator/>
-      </w:r>
-    </w:p>
-  </w:footnote>
-  <w:footnote w:type="continuationSeparator" w:id="0">
-    <w:p>
-      <w:r>
-        <w:continuationSeparator/>
-      </w:r>
-    </w:p>
-  </w:footnote>
-</w:footnotes>
+<file path=word/header2.xml><?xml version="1.0" encoding="utf-8"?>
+<w:hdr xmlns:w="http://schemas.openxmlformats.org/wordprocessingml/2006/main"/>
 </file>
 
 <file path=word/numbering.xml><?xml version="1.0" encoding="utf-8"?>

</xml_diff>